<commit_message>
wip: penetration test clean, docs
Co-Authored-By: Claude Opus 5.5 (1M context) <noreply@anthropic.com>
</commit_message>
<xml_diff>
--- a/docs/design_guidelines.docx
+++ b/docs/design_guidelines.docx
@@ -20,6 +20,18 @@
       </w:r>
       <w:r>
         <w:t xml:space="preserve">The tank should fill to the height of the supply header source point, i.e., if I dig a hole and put the tank in it, I might be able to completely fill it. Otherwise, I may need a pump to fill it up. </w:t>
+      </w:r>
+    </w:p>
+    <w:p>
+      <w:pPr>
+        <w:pStyle w:val="ListParagraph"/>
+        <w:numPr>
+          <w:ilvl w:val="0"/>
+          <w:numId w:val="2"/>
+        </w:numPr>
+      </w:pPr>
+      <w:r>
+        <w:t xml:space="preserve">Pumps should operate on the basic principle that </w:t>
       </w:r>
     </w:p>
     <w:sectPr>

</xml_diff>